<commit_message>
L35 完成数更新：29,996/30,000→30,000/30,000 + 15,000/15,000（resume 后全量成功）
</commit_message>
<xml_diff>
--- a/docs/submission_JGG.docx
+++ b/docs/submission_JGG.docx
@@ -224,10 +224,19 @@
         <w:rPr>
           <w:b/>
         </w:rPr>
-        <w:t>29,996/30,000 (99.99%)</w:t>
-      </w:r>
-      <w:r>
-        <w:t xml:space="preserve"> variant-model pairs completed successfully; 4 pairs (0.08%, Qwen endpoint) failed permanently and were excluded. All analyses use binary Pathogenic vs. Benign evaluation with VUS treated as abstention (see Methods).</w:t>
+        <w:t>30,000/30,000</w:t>
+      </w:r>
+      <w:r>
+        <w:t xml:space="preserve"> domestic and </w:t>
+      </w:r>
+      <w:r>
+        <w:rPr>
+          <w:b/>
+        </w:rPr>
+        <w:t>15,000/15,000</w:t>
+      </w:r>
+      <w:r>
+        <w:t xml:space="preserve"> international variant-model pairs completed successfully (4 initial parse failures were automatically retried). All analyses use binary Pathogenic vs. Benign evaluation with VUS treated as abstention (see Methods).</w:t>
       </w:r>
     </w:p>
     <w:p>

</xml_diff>